<commit_message>
Add formatted Word (.docx) SysAdmin Resume with custom styling
</commit_message>
<xml_diff>
--- a/Efrain_Rivas_SysAdmin_Resume.docx
+++ b/Efrain_Rivas_SysAdmin_Resume.docx
@@ -1124,7 +1124,7 @@
                 <w:color w:val="0F172A"/>
                 <w:sz w:val="17"/>
               </w:rPr>
-              <w:t>Renamarr (Creator)</w:t>
+              <w:t>NovaFlix (Creator)</w:t>
               <w:br/>
             </w:r>
             <w:r>
@@ -1133,7 +1133,7 @@
                 <w:color w:val="0284C7"/>
                 <w:sz w:val="15"/>
               </w:rPr>
-              <w:t>https://github.com/digdast/renamarr</w:t>
+              <w:t>https://github.com/digdast/novaflix</w:t>
               <w:br/>
             </w:r>
             <w:r>
@@ -1142,10 +1142,62 @@
                 <w:color w:val="334155"/>
                 <w:sz w:val="16"/>
               </w:rPr>
-              <w:t>Open-source media asset organizer with zero-config IMDb/TVMaze metadata engine, recursive UNC network share renaming, and 1-click batch undo ledger.</w:t>
+              <w:t>Sovereign open media platform &amp; home theater engine (Plex/Jellyfin alternative) with 4K HDR Direct Play, HTTP 206 Range streaming, remote access, and SyncPlay.</w:t>
             </w:r>
           </w:p>
         </w:tc>
+        <w:tc>
+          <w:tcPr>
+            <w:tcW w:type="dxa" w:w="5328"/>
+            <w:shd w:fill="F8FAFC"/>
+            <w:tcMar>
+              <w:top w:w="60" w:type="dxa"/>
+              <w:bottom w:w="60" w:type="dxa"/>
+              <w:left w:w="90" w:type="dxa"/>
+              <w:right w:w="90" w:type="dxa"/>
+            </w:tcMar>
+            <w:tcBorders>
+              <w:top w:val="single" w:sz="4" w:space="0" w:color="E2E8F0"/>
+              <w:left w:val="single" w:sz="12" w:space="0" w:color="0284C7"/>
+              <w:bottom w:val="single" w:sz="4" w:space="0" w:color="E2E8F0"/>
+              <w:right w:val="single" w:sz="4" w:space="0" w:color="E2E8F0"/>
+            </w:tcBorders>
+          </w:tcPr>
+          <w:p>
+            <w:pPr>
+              <w:spacing w:before="20" w:after="20"/>
+            </w:pPr>
+            <w:r>
+              <w:rPr>
+                <w:rFonts w:ascii="Segoe UI" w:hAnsi="Segoe UI"/>
+                <w:b/>
+                <w:color w:val="0F172A"/>
+                <w:sz w:val="17"/>
+              </w:rPr>
+              <w:t>AegisDNS (Creator)</w:t>
+              <w:br/>
+            </w:r>
+            <w:r>
+              <w:rPr>
+                <w:rFonts w:ascii="Consolas" w:hAnsi="Consolas"/>
+                <w:color w:val="0284C7"/>
+                <w:sz w:val="15"/>
+              </w:rPr>
+              <w:t>https://github.com/digdast/aegisdns</w:t>
+              <w:br/>
+            </w:r>
+            <w:r>
+              <w:rPr>
+                <w:rFonts w:ascii="Segoe UI" w:hAnsi="Segoe UI"/>
+                <w:color w:val="334155"/>
+                <w:sz w:val="16"/>
+              </w:rPr>
+              <w:t>Recursive DNS resolver &amp; RFC 8484 DNS-over-HTTPS (DoH) engine traversing root hints with zero telemetry, 227k+ threat sinkhole rules, and real-time cyber UI.</w:t>
+            </w:r>
+          </w:p>
+        </w:tc>
+      </w:tr>
+      <w:tr>
         <w:tc>
           <w:tcPr>
             <w:tcW w:type="dxa" w:w="5328"/>
@@ -1196,8 +1248,108 @@
             </w:r>
           </w:p>
         </w:tc>
+        <w:tc>
+          <w:tcPr>
+            <w:tcW w:type="dxa" w:w="5328"/>
+            <w:shd w:fill="F8FAFC"/>
+            <w:tcMar>
+              <w:top w:w="60" w:type="dxa"/>
+              <w:bottom w:w="60" w:type="dxa"/>
+              <w:left w:w="90" w:type="dxa"/>
+              <w:right w:w="90" w:type="dxa"/>
+            </w:tcMar>
+            <w:tcBorders>
+              <w:top w:val="single" w:sz="4" w:space="0" w:color="E2E8F0"/>
+              <w:left w:val="single" w:sz="12" w:space="0" w:color="0284C7"/>
+              <w:bottom w:val="single" w:sz="4" w:space="0" w:color="E2E8F0"/>
+              <w:right w:val="single" w:sz="4" w:space="0" w:color="E2E8F0"/>
+            </w:tcBorders>
+          </w:tcPr>
+          <w:p>
+            <w:pPr>
+              <w:spacing w:before="20" w:after="20"/>
+            </w:pPr>
+            <w:r>
+              <w:rPr>
+                <w:rFonts w:ascii="Segoe UI" w:hAnsi="Segoe UI"/>
+                <w:b/>
+                <w:color w:val="0F172A"/>
+                <w:sz w:val="17"/>
+              </w:rPr>
+              <w:t>Renamarr (Creator)</w:t>
+              <w:br/>
+            </w:r>
+            <w:r>
+              <w:rPr>
+                <w:rFonts w:ascii="Consolas" w:hAnsi="Consolas"/>
+                <w:color w:val="0284C7"/>
+                <w:sz w:val="15"/>
+              </w:rPr>
+              <w:t>https://github.com/digdast/renamarr</w:t>
+              <w:br/>
+            </w:r>
+            <w:r>
+              <w:rPr>
+                <w:rFonts w:ascii="Segoe UI" w:hAnsi="Segoe UI"/>
+                <w:color w:val="334155"/>
+                <w:sz w:val="16"/>
+              </w:rPr>
+              <w:t>Open-source media asset organizer with zero-config IMDb/TVMaze metadata engine, recursive UNC network share renaming, and 1-click batch undo ledger.</w:t>
+            </w:r>
+          </w:p>
+        </w:tc>
       </w:tr>
       <w:tr>
+        <w:tc>
+          <w:tcPr>
+            <w:tcW w:type="dxa" w:w="5328"/>
+            <w:shd w:fill="F8FAFC"/>
+            <w:tcMar>
+              <w:top w:w="60" w:type="dxa"/>
+              <w:bottom w:w="60" w:type="dxa"/>
+              <w:left w:w="90" w:type="dxa"/>
+              <w:right w:w="90" w:type="dxa"/>
+            </w:tcMar>
+            <w:tcBorders>
+              <w:top w:val="single" w:sz="4" w:space="0" w:color="E2E8F0"/>
+              <w:left w:val="single" w:sz="12" w:space="0" w:color="0284C7"/>
+              <w:bottom w:val="single" w:sz="4" w:space="0" w:color="E2E8F0"/>
+              <w:right w:val="single" w:sz="4" w:space="0" w:color="E2E8F0"/>
+            </w:tcBorders>
+          </w:tcPr>
+          <w:p>
+            <w:pPr>
+              <w:spacing w:before="20" w:after="20"/>
+            </w:pPr>
+            <w:r>
+              <w:rPr>
+                <w:rFonts w:ascii="Segoe UI" w:hAnsi="Segoe UI"/>
+                <w:b/>
+                <w:color w:val="0F172A"/>
+                <w:sz w:val="17"/>
+              </w:rPr>
+              <w:t>Proxmox Cluster Suite</w:t>
+              <w:br/>
+            </w:r>
+            <w:r>
+              <w:rPr>
+                <w:rFonts w:ascii="Consolas" w:hAnsi="Consolas"/>
+                <w:color w:val="0284C7"/>
+                <w:sz w:val="15"/>
+              </w:rPr>
+              <w:t>https://github.com/digdast/proxmox-cluster-suite</w:t>
+              <w:br/>
+            </w:r>
+            <w:r>
+              <w:rPr>
+                <w:rFonts w:ascii="Segoe UI" w:hAnsi="Segoe UI"/>
+                <w:color w:val="334155"/>
+                <w:sz w:val="16"/>
+              </w:rPr>
+              <w:t>Automated enterprise optimization, no-sub repo activation, nag removal, CPU governor, and real-time web monitoring for 5-node Proxmox VE HA clusters.</w:t>
+            </w:r>
+          </w:p>
+        </w:tc>
         <w:tc>
           <w:tcPr>
             <w:tcW w:type="dxa" w:w="5328"/>
@@ -1245,56 +1397,6 @@
                 <w:sz w:val="16"/>
               </w:rPr>
               <w:t>58 production PowerShell automation modules covering Autopilot pre-provisioning, BitLocker cipher detection, driver crash telemetry, and remediations.</w:t>
-            </w:r>
-          </w:p>
-        </w:tc>
-        <w:tc>
-          <w:tcPr>
-            <w:tcW w:type="dxa" w:w="5328"/>
-            <w:shd w:fill="F8FAFC"/>
-            <w:tcMar>
-              <w:top w:w="60" w:type="dxa"/>
-              <w:bottom w:w="60" w:type="dxa"/>
-              <w:left w:w="90" w:type="dxa"/>
-              <w:right w:w="90" w:type="dxa"/>
-            </w:tcMar>
-            <w:tcBorders>
-              <w:top w:val="single" w:sz="4" w:space="0" w:color="E2E8F0"/>
-              <w:left w:val="single" w:sz="12" w:space="0" w:color="0284C7"/>
-              <w:bottom w:val="single" w:sz="4" w:space="0" w:color="E2E8F0"/>
-              <w:right w:val="single" w:sz="4" w:space="0" w:color="E2E8F0"/>
-            </w:tcBorders>
-          </w:tcPr>
-          <w:p>
-            <w:pPr>
-              <w:spacing w:before="20" w:after="20"/>
-            </w:pPr>
-            <w:r>
-              <w:rPr>
-                <w:rFonts w:ascii="Segoe UI" w:hAnsi="Segoe UI"/>
-                <w:b/>
-                <w:color w:val="0F172A"/>
-                <w:sz w:val="17"/>
-              </w:rPr>
-              <w:t>Proxmox K3s Bare-Metal K8s</w:t>
-              <w:br/>
-            </w:r>
-            <w:r>
-              <w:rPr>
-                <w:rFonts w:ascii="Consolas" w:hAnsi="Consolas"/>
-                <w:color w:val="0284C7"/>
-                <w:sz w:val="15"/>
-              </w:rPr>
-              <w:t>https://github.com/digdast/k3s-prox-lxc</w:t>
-              <w:br/>
-            </w:r>
-            <w:r>
-              <w:rPr>
-                <w:rFonts w:ascii="Segoe UI" w:hAnsi="Segoe UI"/>
-                <w:color w:val="334155"/>
-                <w:sz w:val="16"/>
-              </w:rPr>
-              <w:t>Automated Ansible framework provisioning lightweight K3s Kubernetes clusters across unprivileged Proxmox LXC containers with cgroups v2.</w:t>
             </w:r>
           </w:p>
         </w:tc>

</xml_diff>

<commit_message>
Update formatted Word (.docx) SysAdmin Resume with custom styling
</commit_message>
<xml_diff>
--- a/Efrain_Rivas_SysAdmin_Resume.docx
+++ b/Efrain_Rivas_SysAdmin_Resume.docx
@@ -124,7 +124,7 @@
           <w:color w:val="334155"/>
           <w:sz w:val="18"/>
         </w:rPr>
-        <w:t>with 20+ years of hands-on enterprise infrastructure experience designing, modernizing, and automating mission-critical systems across Microsoft Azure, Active Directory Domain Services, Linux, and multi-hypervisor virtualization clusters. Proven architectural track record deploying global multi-site Active Directory forests across 7 data centers, engineering 5-stage financial CI/CD release pipelines with 99.999% SLA uptime, and implementing zero-touch endpoint provisioning via Microsoft Intune and Windows Autopilot. Creator of high-performance open-source automation tooling (Pulsearr, Renamarr, 50+ Intune remediation modules) with deep expertise in PowerShell, Python, and enterprise identity governance.</w:t>
+        <w:t>with 20+ years of hands-on enterprise infrastructure experience designing, modernizing, and automating mission-critical systems across Microsoft Azure, Kubernetes, Active Directory Domain Services, Linux, and multi-hypervisor virtualization clusters. Proven architectural track record deploying global multi-site Active Directory forests across 7 data centers, engineering 5-stage financial CI/CD release pipelines with 99.999% SLA uptime, orchestrating high-availability containerized microservices clusters, and implementing zero-touch endpoint provisioning via Microsoft Intune and Windows Autopilot. Creator of high-performance open-source automation platforms (NovaFlix, AegisDNS, Pulsearr, Proxmox Cluster Suite, 58+ Intune remediation modules) with deep expertise in PowerShell, Python, Proxmox VE clustering, and enterprise identity governance.</w:t>
       </w:r>
     </w:p>
     <w:p>
@@ -203,10 +203,53 @@
                 <w:color w:val="334155"/>
                 <w:sz w:val="16"/>
               </w:rPr>
-              <w:t>Microsoft Azure (VMs, VNets, NSGs, Azure Files, Runbooks), Entra ID (Azure AD), Active Directory DS, Hybrid Identity (PHS/PTA), Group Policy (GPO), Exchange Online, M365 Administration.</w:t>
+              <w:t>Microsoft Azure (VMs, VNets, NSGs, AKS, Azure Files, Runbooks), Entra ID (Azure AD), Active Directory DS, Hybrid Identity (PHS/PTA), Group Policy (GPO), Exchange Online, M365 Administration.</w:t>
             </w:r>
           </w:p>
         </w:tc>
+        <w:tc>
+          <w:tcPr>
+            <w:tcW w:type="dxa" w:w="5328"/>
+            <w:shd w:fill="F8FAFC"/>
+            <w:tcMar>
+              <w:top w:w="60" w:type="dxa"/>
+              <w:bottom w:w="60" w:type="dxa"/>
+              <w:left w:w="100" w:type="dxa"/>
+              <w:right w:w="100" w:type="dxa"/>
+            </w:tcMar>
+            <w:tcBorders>
+              <w:top w:val="single" w:sz="4" w:space="0" w:color="E2E8F0"/>
+              <w:left w:val="single" w:sz="12" w:space="0" w:color="0284C7"/>
+              <w:bottom w:val="single" w:sz="4" w:space="0" w:color="E2E8F0"/>
+              <w:right w:val="single" w:sz="4" w:space="0" w:color="E2E8F0"/>
+            </w:tcBorders>
+          </w:tcPr>
+          <w:p>
+            <w:pPr>
+              <w:spacing w:before="20" w:after="40"/>
+            </w:pPr>
+            <w:r>
+              <w:rPr>
+                <w:rFonts w:ascii="Consolas" w:hAnsi="Consolas"/>
+                <w:b/>
+                <w:color w:val="0284C7"/>
+                <w:sz w:val="16"/>
+              </w:rPr>
+              <w:t>▶ CONTAINERS &amp; KUBERNETES</w:t>
+              <w:br/>
+            </w:r>
+            <w:r>
+              <w:rPr>
+                <w:rFonts w:ascii="Segoe UI" w:hAnsi="Segoe UI"/>
+                <w:color w:val="334155"/>
+                <w:sz w:val="16"/>
+              </w:rPr>
+              <w:t>Kubernetes (k3s / k8s HA clusters), Control-Plane Failover, Worker Pools, Traefik Ingress, Shared NFS Persistent Storage, Pod Auto-Recovery, Rolling Deployments, Docker Containers.</w:t>
+            </w:r>
+          </w:p>
+        </w:tc>
+      </w:tr>
+      <w:tr>
         <w:tc>
           <w:tcPr>
             <w:tcW w:type="dxa" w:w="5328"/>
@@ -244,12 +287,10 @@
                 <w:color w:val="334155"/>
                 <w:sz w:val="16"/>
               </w:rPr>
-              <w:t>VMware vSphere / ESXi, Linux KVM, Citrix XenServer, XCP-NG, Microsoft Hyper-V, Proxmox VE, Azure Virtual Desktop (AVD), FSLogix Profiles, SAN/NFS Clustering.</w:t>
+              <w:t>Proxmox VE (HA Cluster), VMware vSphere / ESXi, Linux KVM, Citrix XenServer, Microsoft Hyper-V, Zero-Balloon Memory Tuning, Azure Virtual Desktop (AVD), FSLogix Profiles, SAN/NFS Clustering.</w:t>
             </w:r>
           </w:p>
         </w:tc>
-      </w:tr>
-      <w:tr>
         <w:tc>
           <w:tcPr>
             <w:tcW w:type="dxa" w:w="5328"/>
@@ -287,10 +328,12 @@
                 <w:color w:val="334155"/>
                 <w:sz w:val="16"/>
               </w:rPr>
-              <w:t>PowerShell 7+, Python (Asyncio/FastAPI), Bash, CI/CD Delivery Pipelines (DEV/QA/UAT/Staging/PROD), Azure Automation Runbooks, Git / GitHub Actions, REST API Integration.</w:t>
+              <w:t>PowerShell 7+, Python (Asyncio/FastAPI), Bash, CI/CD Delivery Pipelines (DEV/QA/UAT/Staging/PROD), Azure Automation Runbooks, Systemd Timers/Daemons, Git / GitHub Actions, REST API Integration.</w:t>
             </w:r>
           </w:p>
         </w:tc>
+      </w:tr>
+      <w:tr>
         <w:tc>
           <w:tcPr>
             <w:tcW w:type="dxa" w:w="5328"/>
@@ -328,50 +371,7 @@
                 <w:color w:val="334155"/>
                 <w:sz w:val="16"/>
               </w:rPr>
-              <w:t>Microsoft Intune (MDM/MAM), Windows Autopilot (Zero-Touch), SCCM / MECM, Win32 App Packaging (.intunewin), Proactive Remediations, BitLocker Key Escrow, Patch Governance.</w:t>
-            </w:r>
-          </w:p>
-        </w:tc>
-      </w:tr>
-      <w:tr>
-        <w:tc>
-          <w:tcPr>
-            <w:tcW w:type="dxa" w:w="5328"/>
-            <w:shd w:fill="F8FAFC"/>
-            <w:tcMar>
-              <w:top w:w="60" w:type="dxa"/>
-              <w:bottom w:w="60" w:type="dxa"/>
-              <w:left w:w="100" w:type="dxa"/>
-              <w:right w:w="100" w:type="dxa"/>
-            </w:tcMar>
-            <w:tcBorders>
-              <w:top w:val="single" w:sz="4" w:space="0" w:color="E2E8F0"/>
-              <w:left w:val="single" w:sz="12" w:space="0" w:color="0284C7"/>
-              <w:bottom w:val="single" w:sz="4" w:space="0" w:color="E2E8F0"/>
-              <w:right w:val="single" w:sz="4" w:space="0" w:color="E2E8F0"/>
-            </w:tcBorders>
-          </w:tcPr>
-          <w:p>
-            <w:pPr>
-              <w:spacing w:before="20" w:after="40"/>
-            </w:pPr>
-            <w:r>
-              <w:rPr>
-                <w:rFonts w:ascii="Consolas" w:hAnsi="Consolas"/>
-                <w:b/>
-                <w:color w:val="0284C7"/>
-                <w:sz w:val="16"/>
-              </w:rPr>
-              <w:t>▶ ZERO TRUST &amp; IDENTITY SECURITY</w:t>
-              <w:br/>
-            </w:r>
-            <w:r>
-              <w:rPr>
-                <w:rFonts w:ascii="Segoe UI" w:hAnsi="Segoe UI"/>
-                <w:color w:val="334155"/>
-                <w:sz w:val="16"/>
-              </w:rPr>
-              <w:t>Zero Trust Architecture, Privileged Identity Management (PIM), Risk-Based Conditional Access, SAML 2.0 &amp; OAuth SSO, FIDO2 / MFA, SecOps Hardening, Defender for Cloud, LAPS.</w:t>
+              <w:t>Microsoft Intune (MDM/MAM), Windows Autopilot (Zero-Touch), SCCM / MECM, Win32 App Packaging (.intunewin), Proactive Remediations, BitLocker Key Escrow, Patch Governance, Windows 10/11 &amp; macOS.</w:t>
             </w:r>
           </w:p>
         </w:tc>
@@ -403,7 +403,7 @@
                 <w:color w:val="0284C7"/>
                 <w:sz w:val="16"/>
               </w:rPr>
-              <w:t>▶ ENTERPRISE NETWORKING &amp; STORAGE</w:t>
+              <w:t>▶ ZERO TRUST, DNS &amp; SECURITY</w:t>
               <w:br/>
             </w:r>
             <w:r>
@@ -412,7 +412,7 @@
                 <w:color w:val="334155"/>
                 <w:sz w:val="16"/>
               </w:rPr>
-              <w:t>LAN/WAN Architecture, Routing &amp; Switching, DNS / DHCP, IPsec Site-to-Site VPN, WireGuard, Cloudflare Zero Trust, unRAID/TrueNAS NFS Storage, VOIP Telephony, T1/T3 Circuits.</w:t>
+              <w:t>Zero Trust Security, Automated SSL/TLS (Cloudflare DNS-01), Pi-hole v6 / Unbound DNSSEC Cluster, Privileged Identity (PIM), Conditional Access, SAML 2.0 &amp; OAuth SSO, FIDO2 / MFA, SecOps Hardening, Defender for Cloud.</w:t>
             </w:r>
           </w:p>
         </w:tc>
@@ -531,7 +531,7 @@
           <w:color w:val="0F172A"/>
           <w:sz w:val="17"/>
         </w:rPr>
-        <w:t xml:space="preserve">Hybrid Identity &amp; Entra ID Modernization: </w:t>
+        <w:t xml:space="preserve">High-Availability Kubernetes Orchestration: </w:t>
       </w:r>
       <w:r>
         <w:rPr>
@@ -539,7 +539,7 @@
           <w:color w:val="334155"/>
           <w:sz w:val="17"/>
         </w:rPr>
-        <w:t>Architect and execute enterprise migrations from legacy on-premises Active Directory to Microsoft Entra ID (Azure AD), implementing Password Hash Sync (PHS), Seamless SSO, and risk-based Conditional Access policies.</w:t>
+        <w:t>Architect and deploy resilient multi-node Kubernetes clusters with control-plane replication, worker pools, Traefik ingress routing, and shared NFS persistent storage; engineered 4-replica zero-downtime deployments with health checks and automated failover.</w:t>
       </w:r>
     </w:p>
     <w:p>
@@ -563,7 +563,7 @@
           <w:color w:val="0F172A"/>
           <w:sz w:val="17"/>
         </w:rPr>
-        <w:t xml:space="preserve">Modern Endpoint Transformation: </w:t>
+        <w:t xml:space="preserve">Proxmox VE Fleet Optimization: </w:t>
       </w:r>
       <w:r>
         <w:rPr>
@@ -571,7 +571,71 @@
           <w:color w:val="334155"/>
           <w:sz w:val="17"/>
         </w:rPr>
-        <w:t>Modernize legacy SCCM and GPO environments into cloud-native Microsoft Intune configurations; engineered automated Windows Autopilot deployment profiles reducing enterprise hardware onboarding time by over 80%.</w:t>
+        <w:t>Administer multi-node Proxmox VE virtualization clusters, tuning hardware resource allocation, eliminating memory ballooning contention for guaranteed performance, and orchestrating live-migration and automated backup routines.</w:t>
+      </w:r>
+    </w:p>
+    <w:p>
+      <w:pPr>
+        <w:spacing w:before="20" w:after="40"/>
+        <w:ind w:left="288"/>
+      </w:pPr>
+      <w:r>
+        <w:rPr>
+          <w:rFonts w:ascii="Consolas" w:hAnsi="Consolas"/>
+          <w:b/>
+          <w:color w:val="0284C7"/>
+          <w:sz w:val="17"/>
+        </w:rPr>
+        <w:t xml:space="preserve">▸ </w:t>
+      </w:r>
+      <w:r>
+        <w:rPr>
+          <w:rFonts w:ascii="Segoe UI" w:hAnsi="Segoe UI"/>
+          <w:b/>
+          <w:color w:val="0F172A"/>
+          <w:sz w:val="17"/>
+        </w:rPr>
+        <w:t xml:space="preserve">DNSSEC &amp; Automated SSL/TLS Lifecycle: </w:t>
+      </w:r>
+      <w:r>
+        <w:rPr>
+          <w:rFonts w:ascii="Segoe UI" w:hAnsi="Segoe UI"/>
+          <w:color w:val="334155"/>
+          <w:sz w:val="17"/>
+        </w:rPr>
+        <w:t>Engineered tri-node synchronized Pi-hole v6 and Unbound recursive DNS clusters with root-hint recursion and DNSSEC validation; built automated Let's Encrypt wildcard certificate renewal pipelines via Cloudflare DNS-01 APIs and systemd timers.</w:t>
+      </w:r>
+    </w:p>
+    <w:p>
+      <w:pPr>
+        <w:spacing w:before="20" w:after="40"/>
+        <w:ind w:left="288"/>
+      </w:pPr>
+      <w:r>
+        <w:rPr>
+          <w:rFonts w:ascii="Consolas" w:hAnsi="Consolas"/>
+          <w:b/>
+          <w:color w:val="0284C7"/>
+          <w:sz w:val="17"/>
+        </w:rPr>
+        <w:t xml:space="preserve">▸ </w:t>
+      </w:r>
+      <w:r>
+        <w:rPr>
+          <w:rFonts w:ascii="Segoe UI" w:hAnsi="Segoe UI"/>
+          <w:b/>
+          <w:color w:val="0F172A"/>
+          <w:sz w:val="17"/>
+        </w:rPr>
+        <w:t xml:space="preserve">Hybrid Identity &amp; Modern Endpoint: </w:t>
+      </w:r>
+      <w:r>
+        <w:rPr>
+          <w:rFonts w:ascii="Segoe UI" w:hAnsi="Segoe UI"/>
+          <w:color w:val="334155"/>
+          <w:sz w:val="17"/>
+        </w:rPr>
+        <w:t>Architect hybrid AD to Entra ID synchronizations with PHS and Conditional Access; modernize SCCM/GPO environments to Intune with zero-touch Autopilot.</w:t>
       </w:r>
     </w:p>
     <w:p>
@@ -1226,7 +1290,7 @@
                 <w:color w:val="0F172A"/>
                 <w:sz w:val="17"/>
               </w:rPr>
-              <w:t>Pulsearr (Creator)</w:t>
+              <w:t>HA Kubernetes Cluster &amp; Ingress</w:t>
               <w:br/>
             </w:r>
             <w:r>
@@ -1235,7 +1299,7 @@
                 <w:color w:val="0284C7"/>
                 <w:sz w:val="15"/>
               </w:rPr>
-              <w:t>https://github.com/digdast/pulsearr</w:t>
+              <w:t>https://resume.ertechlab.com</w:t>
               <w:br/>
             </w:r>
             <w:r>
@@ -1244,62 +1308,10 @@
                 <w:color w:val="334155"/>
                 <w:sz w:val="16"/>
               </w:rPr>
-              <w:t>Lightweight unified media daemon combining Sonarr, Radarr, and Prowlarr; built with FastAPI, asyncio, and SQLite WAL mode (85MB idle RAM vs 1.2GB .NET stack).</w:t>
+              <w:t>Orchestrated multi-node k8s cluster with Traefik ingress, shared NFS storage, and automated 4-replica zero-downtime web application hosting.</w:t>
             </w:r>
           </w:p>
         </w:tc>
-        <w:tc>
-          <w:tcPr>
-            <w:tcW w:type="dxa" w:w="5328"/>
-            <w:shd w:fill="F8FAFC"/>
-            <w:tcMar>
-              <w:top w:w="60" w:type="dxa"/>
-              <w:bottom w:w="60" w:type="dxa"/>
-              <w:left w:w="90" w:type="dxa"/>
-              <w:right w:w="90" w:type="dxa"/>
-            </w:tcMar>
-            <w:tcBorders>
-              <w:top w:val="single" w:sz="4" w:space="0" w:color="E2E8F0"/>
-              <w:left w:val="single" w:sz="12" w:space="0" w:color="0284C7"/>
-              <w:bottom w:val="single" w:sz="4" w:space="0" w:color="E2E8F0"/>
-              <w:right w:val="single" w:sz="4" w:space="0" w:color="E2E8F0"/>
-            </w:tcBorders>
-          </w:tcPr>
-          <w:p>
-            <w:pPr>
-              <w:spacing w:before="20" w:after="20"/>
-            </w:pPr>
-            <w:r>
-              <w:rPr>
-                <w:rFonts w:ascii="Segoe UI" w:hAnsi="Segoe UI"/>
-                <w:b/>
-                <w:color w:val="0F172A"/>
-                <w:sz w:val="17"/>
-              </w:rPr>
-              <w:t>Renamarr (Creator)</w:t>
-              <w:br/>
-            </w:r>
-            <w:r>
-              <w:rPr>
-                <w:rFonts w:ascii="Consolas" w:hAnsi="Consolas"/>
-                <w:color w:val="0284C7"/>
-                <w:sz w:val="15"/>
-              </w:rPr>
-              <w:t>https://github.com/digdast/renamarr</w:t>
-              <w:br/>
-            </w:r>
-            <w:r>
-              <w:rPr>
-                <w:rFonts w:ascii="Segoe UI" w:hAnsi="Segoe UI"/>
-                <w:color w:val="334155"/>
-                <w:sz w:val="16"/>
-              </w:rPr>
-              <w:t>Open-source media asset organizer with zero-config IMDb/TVMaze metadata engine, recursive UNC network share renaming, and 1-click batch undo ledger.</w:t>
-            </w:r>
-          </w:p>
-        </w:tc>
-      </w:tr>
-      <w:tr>
         <w:tc>
           <w:tcPr>
             <w:tcW w:type="dxa" w:w="5328"/>
@@ -1346,7 +1358,59 @@
                 <w:color w:val="334155"/>
                 <w:sz w:val="16"/>
               </w:rPr>
-              <w:t>Automated enterprise optimization, no-sub repo activation, nag removal, CPU governor, and real-time web monitoring for 5-node Proxmox VE HA clusters.</w:t>
+              <w:t>Automated enterprise optimization, no-sub repo activation, nag removal, CPU governor, memory ballooning elimination, and real-time HA monitoring.</w:t>
+            </w:r>
+          </w:p>
+        </w:tc>
+      </w:tr>
+      <w:tr>
+        <w:tc>
+          <w:tcPr>
+            <w:tcW w:type="dxa" w:w="5328"/>
+            <w:shd w:fill="F8FAFC"/>
+            <w:tcMar>
+              <w:top w:w="60" w:type="dxa"/>
+              <w:bottom w:w="60" w:type="dxa"/>
+              <w:left w:w="90" w:type="dxa"/>
+              <w:right w:w="90" w:type="dxa"/>
+            </w:tcMar>
+            <w:tcBorders>
+              <w:top w:val="single" w:sz="4" w:space="0" w:color="E2E8F0"/>
+              <w:left w:val="single" w:sz="12" w:space="0" w:color="0284C7"/>
+              <w:bottom w:val="single" w:sz="4" w:space="0" w:color="E2E8F0"/>
+              <w:right w:val="single" w:sz="4" w:space="0" w:color="E2E8F0"/>
+            </w:tcBorders>
+          </w:tcPr>
+          <w:p>
+            <w:pPr>
+              <w:spacing w:before="20" w:after="20"/>
+            </w:pPr>
+            <w:r>
+              <w:rPr>
+                <w:rFonts w:ascii="Segoe UI" w:hAnsi="Segoe UI"/>
+                <w:b/>
+                <w:color w:val="0F172A"/>
+                <w:sz w:val="17"/>
+              </w:rPr>
+              <w:t>Pulsearr (Creator)</w:t>
+              <w:br/>
+            </w:r>
+            <w:r>
+              <w:rPr>
+                <w:rFonts w:ascii="Consolas" w:hAnsi="Consolas"/>
+                <w:color w:val="0284C7"/>
+                <w:sz w:val="15"/>
+              </w:rPr>
+              <w:t>https://github.com/digdast/pulsearr</w:t>
+              <w:br/>
+            </w:r>
+            <w:r>
+              <w:rPr>
+                <w:rFonts w:ascii="Segoe UI" w:hAnsi="Segoe UI"/>
+                <w:color w:val="334155"/>
+                <w:sz w:val="16"/>
+              </w:rPr>
+              <w:t>Lightweight unified media daemon combining Sonarr, Radarr, and Prowlarr; built with FastAPI, asyncio, and SQLite WAL mode (85MB idle RAM vs 1.2GB .NET stack).</w:t>
             </w:r>
           </w:p>
         </w:tc>

</xml_diff>